<commit_message>
Cập nhật kết quả dữ liệu 7 học kỳ và tài liệu
- reports: đủ 210 lần chạy (10 mô hình + 5 biến thể loại bỏ thành phần) trên lưới 7 học kỳ
- docs/MO_TA_10_THUAT_TOAN: viết lại phần cách hoạt động, bảng kết quả và phương pháp luận theo số liệu học kỳ
- docs/DE_CUONG v4: mục 5.8 bổ sung kết quả loại bỏ thành phần
- frontend: màn Dự đoán ghi rõ mốc gần nhất (HK1 lớp 9)

Co-Authored-By: Claude Opus 5.5 <noreply@anthropic.com>
</commit_message>
<xml_diff>
--- a/docs/DE_CUONG_LUAN_VAN_v4_du_lieu_hoc_ky.docx
+++ b/docs/DE_CUONG_LUAN_VAN_v4_du_lieu_hoc_ky.docx
@@ -704,7 +704,7 @@
         </w:rPr>
       </w:pPr>
       <w:bookmarkStart w:id="0" w:name="_Toc241525744"/>
-      <w:bookmarkStart w:id="1" w:name="_Toc242916453"/>
+      <w:bookmarkStart w:id="1" w:name="_Toc242976250"/>
       <w:r>
         <w:rPr>
           <w:szCs w:val="26"/>
@@ -748,7 +748,7 @@
         </w:rPr>
         <w:fldChar w:fldCharType="separate"/>
       </w:r>
-      <w:hyperlink w:anchor="_Toc242916453" w:history="1">
+      <w:hyperlink w:anchor="_Toc242976250" w:history="1">
         <w:r>
           <w:rPr>
             <w:rStyle w:val="Hyperlink"/>
@@ -775,7 +775,7 @@
             <w:noProof/>
             <w:webHidden/>
           </w:rPr>
-          <w:instrText xml:space="preserve"> PAGEREF _Toc242916453 \h </w:instrText>
+          <w:instrText xml:space="preserve"> PAGEREF _Toc242976250 \h </w:instrText>
         </w:r>
         <w:r>
           <w:rPr>
@@ -818,7 +818,7 @@
           <w14:ligatures w14:val="standardContextual"/>
         </w:rPr>
       </w:pPr>
-      <w:hyperlink w:anchor="_Toc242916454" w:history="1">
+      <w:hyperlink w:anchor="_Toc242976251" w:history="1">
         <w:r>
           <w:rPr>
             <w:rStyle w:val="Hyperlink"/>
@@ -845,7 +845,7 @@
             <w:noProof/>
             <w:webHidden/>
           </w:rPr>
-          <w:instrText xml:space="preserve"> PAGEREF _Toc242916454 \h </w:instrText>
+          <w:instrText xml:space="preserve"> PAGEREF _Toc242976251 \h </w:instrText>
         </w:r>
         <w:r>
           <w:rPr>
@@ -891,7 +891,7 @@
           <w14:ligatures w14:val="standardContextual"/>
         </w:rPr>
       </w:pPr>
-      <w:hyperlink w:anchor="_Toc242916455" w:history="1">
+      <w:hyperlink w:anchor="_Toc242976252" w:history="1">
         <w:r>
           <w:rPr>
             <w:rStyle w:val="Hyperlink"/>
@@ -919,7 +919,7 @@
             <w:noProof/>
             <w:webHidden/>
           </w:rPr>
-          <w:instrText xml:space="preserve"> PAGEREF _Toc242916455 \h </w:instrText>
+          <w:instrText xml:space="preserve"> PAGEREF _Toc242976252 \h </w:instrText>
         </w:r>
         <w:r>
           <w:rPr>
@@ -965,7 +965,7 @@
           <w14:ligatures w14:val="standardContextual"/>
         </w:rPr>
       </w:pPr>
-      <w:hyperlink w:anchor="_Toc242916456" w:history="1">
+      <w:hyperlink w:anchor="_Toc242976253" w:history="1">
         <w:r>
           <w:rPr>
             <w:rStyle w:val="Hyperlink"/>
@@ -992,7 +992,7 @@
             <w:noProof/>
             <w:webHidden/>
           </w:rPr>
-          <w:instrText xml:space="preserve"> PAGEREF _Toc242916456 \h </w:instrText>
+          <w:instrText xml:space="preserve"> PAGEREF _Toc242976253 \h </w:instrText>
         </w:r>
         <w:r>
           <w:rPr>
@@ -1038,7 +1038,7 @@
           <w14:ligatures w14:val="standardContextual"/>
         </w:rPr>
       </w:pPr>
-      <w:hyperlink w:anchor="_Toc242916457" w:history="1">
+      <w:hyperlink w:anchor="_Toc242976254" w:history="1">
         <w:r>
           <w:rPr>
             <w:rStyle w:val="Hyperlink"/>
@@ -1065,7 +1065,7 @@
             <w:noProof/>
             <w:webHidden/>
           </w:rPr>
-          <w:instrText xml:space="preserve"> PAGEREF _Toc242916457 \h </w:instrText>
+          <w:instrText xml:space="preserve"> PAGEREF _Toc242976254 \h </w:instrText>
         </w:r>
         <w:r>
           <w:rPr>
@@ -1108,7 +1108,7 @@
           <w14:ligatures w14:val="standardContextual"/>
         </w:rPr>
       </w:pPr>
-      <w:hyperlink w:anchor="_Toc242916458" w:history="1">
+      <w:hyperlink w:anchor="_Toc242976255" w:history="1">
         <w:r>
           <w:rPr>
             <w:rStyle w:val="Hyperlink"/>
@@ -1135,7 +1135,7 @@
             <w:noProof/>
             <w:webHidden/>
           </w:rPr>
-          <w:instrText xml:space="preserve"> PAGEREF _Toc242916458 \h </w:instrText>
+          <w:instrText xml:space="preserve"> PAGEREF _Toc242976255 \h </w:instrText>
         </w:r>
         <w:r>
           <w:rPr>
@@ -1181,7 +1181,7 @@
           <w14:ligatures w14:val="standardContextual"/>
         </w:rPr>
       </w:pPr>
-      <w:hyperlink w:anchor="_Toc242916459" w:history="1">
+      <w:hyperlink w:anchor="_Toc242976256" w:history="1">
         <w:r>
           <w:rPr>
             <w:rStyle w:val="Hyperlink"/>
@@ -1208,7 +1208,7 @@
             <w:noProof/>
             <w:webHidden/>
           </w:rPr>
-          <w:instrText xml:space="preserve"> PAGEREF _Toc242916459 \h </w:instrText>
+          <w:instrText xml:space="preserve"> PAGEREF _Toc242976256 \h </w:instrText>
         </w:r>
         <w:r>
           <w:rPr>
@@ -1254,7 +1254,7 @@
           <w14:ligatures w14:val="standardContextual"/>
         </w:rPr>
       </w:pPr>
-      <w:hyperlink w:anchor="_Toc242916460" w:history="1">
+      <w:hyperlink w:anchor="_Toc242976257" w:history="1">
         <w:r>
           <w:rPr>
             <w:rStyle w:val="Hyperlink"/>
@@ -1281,7 +1281,7 @@
             <w:noProof/>
             <w:webHidden/>
           </w:rPr>
-          <w:instrText xml:space="preserve"> PAGEREF _Toc242916460 \h </w:instrText>
+          <w:instrText xml:space="preserve"> PAGEREF _Toc242976257 \h </w:instrText>
         </w:r>
         <w:r>
           <w:rPr>
@@ -1324,7 +1324,7 @@
           <w14:ligatures w14:val="standardContextual"/>
         </w:rPr>
       </w:pPr>
-      <w:hyperlink w:anchor="_Toc242916461" w:history="1">
+      <w:hyperlink w:anchor="_Toc242976258" w:history="1">
         <w:r>
           <w:rPr>
             <w:rStyle w:val="Hyperlink"/>
@@ -1351,7 +1351,7 @@
             <w:noProof/>
             <w:webHidden/>
           </w:rPr>
-          <w:instrText xml:space="preserve"> PAGEREF _Toc242916461 \h </w:instrText>
+          <w:instrText xml:space="preserve"> PAGEREF _Toc242976258 \h </w:instrText>
         </w:r>
         <w:r>
           <w:rPr>
@@ -1397,7 +1397,7 @@
           <w14:ligatures w14:val="standardContextual"/>
         </w:rPr>
       </w:pPr>
-      <w:hyperlink w:anchor="_Toc242916462" w:history="1">
+      <w:hyperlink w:anchor="_Toc242976259" w:history="1">
         <w:r>
           <w:rPr>
             <w:rStyle w:val="Hyperlink"/>
@@ -1424,7 +1424,7 @@
             <w:noProof/>
             <w:webHidden/>
           </w:rPr>
-          <w:instrText xml:space="preserve"> PAGEREF _Toc242916462 \h </w:instrText>
+          <w:instrText xml:space="preserve"> PAGEREF _Toc242976259 \h </w:instrText>
         </w:r>
         <w:r>
           <w:rPr>
@@ -1470,7 +1470,7 @@
           <w14:ligatures w14:val="standardContextual"/>
         </w:rPr>
       </w:pPr>
-      <w:hyperlink w:anchor="_Toc242916463" w:history="1">
+      <w:hyperlink w:anchor="_Toc242976260" w:history="1">
         <w:r>
           <w:rPr>
             <w:rStyle w:val="Hyperlink"/>
@@ -1498,7 +1498,7 @@
             <w:noProof/>
             <w:webHidden/>
           </w:rPr>
-          <w:instrText xml:space="preserve"> PAGEREF _Toc242916463 \h </w:instrText>
+          <w:instrText xml:space="preserve"> PAGEREF _Toc242976260 \h </w:instrText>
         </w:r>
         <w:r>
           <w:rPr>
@@ -1544,7 +1544,7 @@
           <w14:ligatures w14:val="standardContextual"/>
         </w:rPr>
       </w:pPr>
-      <w:hyperlink w:anchor="_Toc242916464" w:history="1">
+      <w:hyperlink w:anchor="_Toc242976261" w:history="1">
         <w:r>
           <w:rPr>
             <w:rStyle w:val="Hyperlink"/>
@@ -1572,7 +1572,7 @@
             <w:noProof/>
             <w:webHidden/>
           </w:rPr>
-          <w:instrText xml:space="preserve"> PAGEREF _Toc242916464 \h </w:instrText>
+          <w:instrText xml:space="preserve"> PAGEREF _Toc242976261 \h </w:instrText>
         </w:r>
         <w:r>
           <w:rPr>
@@ -1618,7 +1618,7 @@
           <w14:ligatures w14:val="standardContextual"/>
         </w:rPr>
       </w:pPr>
-      <w:hyperlink w:anchor="_Toc242916465" w:history="1">
+      <w:hyperlink w:anchor="_Toc242976262" w:history="1">
         <w:r>
           <w:rPr>
             <w:rStyle w:val="Hyperlink"/>
@@ -1646,7 +1646,7 @@
             <w:noProof/>
             <w:webHidden/>
           </w:rPr>
-          <w:instrText xml:space="preserve"> PAGEREF _Toc242916465 \h </w:instrText>
+          <w:instrText xml:space="preserve"> PAGEREF _Toc242976262 \h </w:instrText>
         </w:r>
         <w:r>
           <w:rPr>
@@ -1692,7 +1692,7 @@
           <w14:ligatures w14:val="standardContextual"/>
         </w:rPr>
       </w:pPr>
-      <w:hyperlink w:anchor="_Toc242916466" w:history="1">
+      <w:hyperlink w:anchor="_Toc242976263" w:history="1">
         <w:r>
           <w:rPr>
             <w:rStyle w:val="Hyperlink"/>
@@ -1720,7 +1720,7 @@
             <w:noProof/>
             <w:webHidden/>
           </w:rPr>
-          <w:instrText xml:space="preserve"> PAGEREF _Toc242916466 \h </w:instrText>
+          <w:instrText xml:space="preserve"> PAGEREF _Toc242976263 \h </w:instrText>
         </w:r>
         <w:r>
           <w:rPr>
@@ -1766,7 +1766,7 @@
           <w14:ligatures w14:val="standardContextual"/>
         </w:rPr>
       </w:pPr>
-      <w:hyperlink w:anchor="_Toc242916467" w:history="1">
+      <w:hyperlink w:anchor="_Toc242976264" w:history="1">
         <w:r>
           <w:rPr>
             <w:rStyle w:val="Hyperlink"/>
@@ -1794,7 +1794,7 @@
             <w:noProof/>
             <w:webHidden/>
           </w:rPr>
-          <w:instrText xml:space="preserve"> PAGEREF _Toc242916467 \h </w:instrText>
+          <w:instrText xml:space="preserve"> PAGEREF _Toc242976264 \h </w:instrText>
         </w:r>
         <w:r>
           <w:rPr>
@@ -1837,7 +1837,7 @@
           <w14:ligatures w14:val="standardContextual"/>
         </w:rPr>
       </w:pPr>
-      <w:hyperlink w:anchor="_Toc242916468" w:history="1">
+      <w:hyperlink w:anchor="_Toc242976265" w:history="1">
         <w:r>
           <w:rPr>
             <w:rStyle w:val="Hyperlink"/>
@@ -1864,7 +1864,7 @@
             <w:noProof/>
             <w:webHidden/>
           </w:rPr>
-          <w:instrText xml:space="preserve"> PAGEREF _Toc242916468 \h </w:instrText>
+          <w:instrText xml:space="preserve"> PAGEREF _Toc242976265 \h </w:instrText>
         </w:r>
         <w:r>
           <w:rPr>
@@ -1910,7 +1910,7 @@
           <w14:ligatures w14:val="standardContextual"/>
         </w:rPr>
       </w:pPr>
-      <w:hyperlink w:anchor="_Toc242916469" w:history="1">
+      <w:hyperlink w:anchor="_Toc242976266" w:history="1">
         <w:r>
           <w:rPr>
             <w:rStyle w:val="Hyperlink"/>
@@ -1938,7 +1938,7 @@
             <w:noProof/>
             <w:webHidden/>
           </w:rPr>
-          <w:instrText xml:space="preserve"> PAGEREF _Toc242916469 \h </w:instrText>
+          <w:instrText xml:space="preserve"> PAGEREF _Toc242976266 \h </w:instrText>
         </w:r>
         <w:r>
           <w:rPr>
@@ -1984,7 +1984,7 @@
           <w14:ligatures w14:val="standardContextual"/>
         </w:rPr>
       </w:pPr>
-      <w:hyperlink w:anchor="_Toc242916470" w:history="1">
+      <w:hyperlink w:anchor="_Toc242976267" w:history="1">
         <w:r>
           <w:rPr>
             <w:rStyle w:val="Hyperlink"/>
@@ -2012,7 +2012,7 @@
             <w:noProof/>
             <w:webHidden/>
           </w:rPr>
-          <w:instrText xml:space="preserve"> PAGEREF _Toc242916470 \h </w:instrText>
+          <w:instrText xml:space="preserve"> PAGEREF _Toc242976267 \h </w:instrText>
         </w:r>
         <w:r>
           <w:rPr>
@@ -2055,7 +2055,7 @@
           <w14:ligatures w14:val="standardContextual"/>
         </w:rPr>
       </w:pPr>
-      <w:hyperlink w:anchor="_Toc242916471" w:history="1">
+      <w:hyperlink w:anchor="_Toc242976268" w:history="1">
         <w:r>
           <w:rPr>
             <w:rStyle w:val="Hyperlink"/>
@@ -2082,7 +2082,7 @@
             <w:noProof/>
             <w:webHidden/>
           </w:rPr>
-          <w:instrText xml:space="preserve"> PAGEREF _Toc242916471 \h </w:instrText>
+          <w:instrText xml:space="preserve"> PAGEREF _Toc242976268 \h </w:instrText>
         </w:r>
         <w:r>
           <w:rPr>
@@ -2128,7 +2128,7 @@
           <w14:ligatures w14:val="standardContextual"/>
         </w:rPr>
       </w:pPr>
-      <w:hyperlink w:anchor="_Toc242916472" w:history="1">
+      <w:hyperlink w:anchor="_Toc242976269" w:history="1">
         <w:r>
           <w:rPr>
             <w:rStyle w:val="Hyperlink"/>
@@ -2156,7 +2156,7 @@
             <w:noProof/>
             <w:webHidden/>
           </w:rPr>
-          <w:instrText xml:space="preserve"> PAGEREF _Toc242916472 \h </w:instrText>
+          <w:instrText xml:space="preserve"> PAGEREF _Toc242976269 \h </w:instrText>
         </w:r>
         <w:r>
           <w:rPr>
@@ -2202,7 +2202,7 @@
           <w14:ligatures w14:val="standardContextual"/>
         </w:rPr>
       </w:pPr>
-      <w:hyperlink w:anchor="_Toc242916473" w:history="1">
+      <w:hyperlink w:anchor="_Toc242976270" w:history="1">
         <w:r>
           <w:rPr>
             <w:rStyle w:val="Hyperlink"/>
@@ -2230,7 +2230,7 @@
             <w:noProof/>
             <w:webHidden/>
           </w:rPr>
-          <w:instrText xml:space="preserve"> PAGEREF _Toc242916473 \h </w:instrText>
+          <w:instrText xml:space="preserve"> PAGEREF _Toc242976270 \h </w:instrText>
         </w:r>
         <w:r>
           <w:rPr>
@@ -2276,7 +2276,7 @@
           <w14:ligatures w14:val="standardContextual"/>
         </w:rPr>
       </w:pPr>
-      <w:hyperlink w:anchor="_Toc242916474" w:history="1">
+      <w:hyperlink w:anchor="_Toc242976271" w:history="1">
         <w:r>
           <w:rPr>
             <w:rStyle w:val="Hyperlink"/>
@@ -2304,7 +2304,7 @@
             <w:noProof/>
             <w:webHidden/>
           </w:rPr>
-          <w:instrText xml:space="preserve"> PAGEREF _Toc242916474 \h </w:instrText>
+          <w:instrText xml:space="preserve"> PAGEREF _Toc242976271 \h </w:instrText>
         </w:r>
         <w:r>
           <w:rPr>
@@ -2350,7 +2350,7 @@
           <w14:ligatures w14:val="standardContextual"/>
         </w:rPr>
       </w:pPr>
-      <w:hyperlink w:anchor="_Toc242916475" w:history="1">
+      <w:hyperlink w:anchor="_Toc242976272" w:history="1">
         <w:r>
           <w:rPr>
             <w:rStyle w:val="Hyperlink"/>
@@ -2378,7 +2378,7 @@
             <w:noProof/>
             <w:webHidden/>
           </w:rPr>
-          <w:instrText xml:space="preserve"> PAGEREF _Toc242916475 \h </w:instrText>
+          <w:instrText xml:space="preserve"> PAGEREF _Toc242976272 \h </w:instrText>
         </w:r>
         <w:r>
           <w:rPr>
@@ -2424,7 +2424,7 @@
           <w14:ligatures w14:val="standardContextual"/>
         </w:rPr>
       </w:pPr>
-      <w:hyperlink w:anchor="_Toc242916476" w:history="1">
+      <w:hyperlink w:anchor="_Toc242976273" w:history="1">
         <w:r>
           <w:rPr>
             <w:rStyle w:val="Hyperlink"/>
@@ -2452,7 +2452,7 @@
             <w:noProof/>
             <w:webHidden/>
           </w:rPr>
-          <w:instrText xml:space="preserve"> PAGEREF _Toc242916476 \h </w:instrText>
+          <w:instrText xml:space="preserve"> PAGEREF _Toc242976273 \h </w:instrText>
         </w:r>
         <w:r>
           <w:rPr>
@@ -2498,7 +2498,7 @@
           <w14:ligatures w14:val="standardContextual"/>
         </w:rPr>
       </w:pPr>
-      <w:hyperlink w:anchor="_Toc242916477" w:history="1">
+      <w:hyperlink w:anchor="_Toc242976274" w:history="1">
         <w:r>
           <w:rPr>
             <w:rStyle w:val="Hyperlink"/>
@@ -2526,7 +2526,7 @@
             <w:noProof/>
             <w:webHidden/>
           </w:rPr>
-          <w:instrText xml:space="preserve"> PAGEREF _Toc242916477 \h </w:instrText>
+          <w:instrText xml:space="preserve"> PAGEREF _Toc242976274 \h </w:instrText>
         </w:r>
         <w:r>
           <w:rPr>
@@ -2572,7 +2572,7 @@
           <w14:ligatures w14:val="standardContextual"/>
         </w:rPr>
       </w:pPr>
-      <w:hyperlink w:anchor="_Toc242916478" w:history="1">
+      <w:hyperlink w:anchor="_Toc242976275" w:history="1">
         <w:r>
           <w:rPr>
             <w:rStyle w:val="Hyperlink"/>
@@ -2600,7 +2600,7 @@
             <w:noProof/>
             <w:webHidden/>
           </w:rPr>
-          <w:instrText xml:space="preserve"> PAGEREF _Toc242916478 \h </w:instrText>
+          <w:instrText xml:space="preserve"> PAGEREF _Toc242976275 \h </w:instrText>
         </w:r>
         <w:r>
           <w:rPr>
@@ -2646,7 +2646,7 @@
           <w14:ligatures w14:val="standardContextual"/>
         </w:rPr>
       </w:pPr>
-      <w:hyperlink w:anchor="_Toc242916479" w:history="1">
+      <w:hyperlink w:anchor="_Toc242976276" w:history="1">
         <w:r>
           <w:rPr>
             <w:rStyle w:val="Hyperlink"/>
@@ -2674,7 +2674,7 @@
             <w:noProof/>
             <w:webHidden/>
           </w:rPr>
-          <w:instrText xml:space="preserve"> PAGEREF _Toc242916479 \h </w:instrText>
+          <w:instrText xml:space="preserve"> PAGEREF _Toc242976276 \h </w:instrText>
         </w:r>
         <w:r>
           <w:rPr>
@@ -2717,7 +2717,7 @@
           <w14:ligatures w14:val="standardContextual"/>
         </w:rPr>
       </w:pPr>
-      <w:hyperlink w:anchor="_Toc242916480" w:history="1">
+      <w:hyperlink w:anchor="_Toc242976277" w:history="1">
         <w:r>
           <w:rPr>
             <w:rStyle w:val="Hyperlink"/>
@@ -2744,7 +2744,7 @@
             <w:noProof/>
             <w:webHidden/>
           </w:rPr>
-          <w:instrText xml:space="preserve"> PAGEREF _Toc242916480 \h </w:instrText>
+          <w:instrText xml:space="preserve"> PAGEREF _Toc242976277 \h </w:instrText>
         </w:r>
         <w:r>
           <w:rPr>
@@ -2790,7 +2790,7 @@
           <w14:ligatures w14:val="standardContextual"/>
         </w:rPr>
       </w:pPr>
-      <w:hyperlink w:anchor="_Toc242916481" w:history="1">
+      <w:hyperlink w:anchor="_Toc242976278" w:history="1">
         <w:r>
           <w:rPr>
             <w:rStyle w:val="Hyperlink"/>
@@ -2818,7 +2818,7 @@
             <w:noProof/>
             <w:webHidden/>
           </w:rPr>
-          <w:instrText xml:space="preserve"> PAGEREF _Toc242916481 \h </w:instrText>
+          <w:instrText xml:space="preserve"> PAGEREF _Toc242976278 \h </w:instrText>
         </w:r>
         <w:r>
           <w:rPr>
@@ -2864,7 +2864,7 @@
           <w14:ligatures w14:val="standardContextual"/>
         </w:rPr>
       </w:pPr>
-      <w:hyperlink w:anchor="_Toc242916482" w:history="1">
+      <w:hyperlink w:anchor="_Toc242976279" w:history="1">
         <w:r>
           <w:rPr>
             <w:rStyle w:val="Hyperlink"/>
@@ -2892,7 +2892,7 @@
             <w:noProof/>
             <w:webHidden/>
           </w:rPr>
-          <w:instrText xml:space="preserve"> PAGEREF _Toc242916482 \h </w:instrText>
+          <w:instrText xml:space="preserve"> PAGEREF _Toc242976279 \h </w:instrText>
         </w:r>
         <w:r>
           <w:rPr>
@@ -2938,7 +2938,7 @@
           <w14:ligatures w14:val="standardContextual"/>
         </w:rPr>
       </w:pPr>
-      <w:hyperlink w:anchor="_Toc242916483" w:history="1">
+      <w:hyperlink w:anchor="_Toc242976280" w:history="1">
         <w:r>
           <w:rPr>
             <w:rStyle w:val="Hyperlink"/>
@@ -2966,7 +2966,7 @@
             <w:noProof/>
             <w:webHidden/>
           </w:rPr>
-          <w:instrText xml:space="preserve"> PAGEREF _Toc242916483 \h </w:instrText>
+          <w:instrText xml:space="preserve"> PAGEREF _Toc242976280 \h </w:instrText>
         </w:r>
         <w:r>
           <w:rPr>
@@ -3009,7 +3009,7 @@
           <w14:ligatures w14:val="standardContextual"/>
         </w:rPr>
       </w:pPr>
-      <w:hyperlink w:anchor="_Toc242916484" w:history="1">
+      <w:hyperlink w:anchor="_Toc242976281" w:history="1">
         <w:r>
           <w:rPr>
             <w:rStyle w:val="Hyperlink"/>
@@ -3036,7 +3036,7 @@
             <w:noProof/>
             <w:webHidden/>
           </w:rPr>
-          <w:instrText xml:space="preserve"> PAGEREF _Toc242916484 \h </w:instrText>
+          <w:instrText xml:space="preserve"> PAGEREF _Toc242976281 \h </w:instrText>
         </w:r>
         <w:r>
           <w:rPr>
@@ -3079,7 +3079,7 @@
           <w14:ligatures w14:val="standardContextual"/>
         </w:rPr>
       </w:pPr>
-      <w:hyperlink w:anchor="_Toc242916485" w:history="1">
+      <w:hyperlink w:anchor="_Toc242976282" w:history="1">
         <w:r>
           <w:rPr>
             <w:rStyle w:val="Hyperlink"/>
@@ -3106,7 +3106,7 @@
             <w:noProof/>
             <w:webHidden/>
           </w:rPr>
-          <w:instrText xml:space="preserve"> PAGEREF _Toc242916485 \h </w:instrText>
+          <w:instrText xml:space="preserve"> PAGEREF _Toc242976282 \h </w:instrText>
         </w:r>
         <w:r>
           <w:rPr>
@@ -3168,7 +3168,7 @@
         <w:pStyle w:val="Heading1"/>
       </w:pPr>
       <w:bookmarkStart w:id="2" w:name="_Toc241525745"/>
-      <w:bookmarkStart w:id="3" w:name="_Toc242916454"/>
+      <w:bookmarkStart w:id="3" w:name="_Toc242976251"/>
       <w:r>
         <w:lastRenderedPageBreak/>
         <w:t>1. LÝ DO LỰA CHỌN ĐỀ TÀI</w:t>
@@ -3181,7 +3181,7 @@
         <w:pStyle w:val="Heading2"/>
       </w:pPr>
       <w:bookmarkStart w:id="4" w:name="_Toc241525746"/>
-      <w:bookmarkStart w:id="5" w:name="_Toc242916455"/>
+      <w:bookmarkStart w:id="5" w:name="_Toc242976252"/>
       <w:r>
         <w:rPr>
           <w:rFonts w:eastAsia="Times New Roman"/>
@@ -3206,14 +3206,7 @@
           <w:rFonts w:eastAsia="Times New Roman"/>
           <w:sz w:val="26"/>
         </w:rPr>
-        <w:t>Chuyển đổi số trong giáo dục đã trở thành một định hướng chiến lược của Việt Nam. Quyết định số 131/QĐ-TTg của Thủ tướng Chính phủ yêu cầu xây dựng cơ sở dữ liệu ngành và khai thác dữ liệu để hỗ trợ dạy, học và quản lý [1]. Song song, Thông tư 22/2021/TT-BGDĐT quy định việc đánh giá học sinh THCS bằng điểm số theo từng môn, từng học kỳ và xếp mức kết quả học tập Tốt, Khá, Đạt, Chưa đạt [2]. Nhờ đó, mỗi học sinh cuối cấp THCS đã tích lũy một chuỗi điểm số có cấu trúc rõ ràng từ lớp 6 đến lớp 9 (môn học × học</w:t>
-      </w:r>
-      <w:r>
-        <w:rPr>
-          <w:rFonts w:eastAsia="Times New Roman"/>
-          <w:sz w:val="26"/>
-        </w:rPr>
-        <w:t xml:space="preserve"> kỳ). Đây là nguồn dữ liệu phù hợp cho khai phá dữ liệu giáo dục (Educational Data Mining – EDM) và phân tích học tập (Learning Analytics – LA) [3].</w:t>
+        <w:t>Chuyển đổi số trong giáo dục đã trở thành một định hướng chiến lược của Việt Nam. Quyết định số 131/QĐ-TTg của Thủ tướng Chính phủ yêu cầu xây dựng cơ sở dữ liệu ngành và khai thác dữ liệu để hỗ trợ dạy, học và quản lý [1]. Song song, Thông tư 22/2021/TT-BGDĐT quy định việc đánh giá học sinh THCS bằng điểm số theo từng môn, từng học kỳ và xếp mức kết quả học tập Tốt, Khá, Đạt, Chưa đạt [2]. Nhờ đó, mỗi học sinh cuối cấp THCS đã tích lũy một chuỗi điểm số có cấu trúc rõ ràng từ lớp 6 đến lớp 9 (môn học × học kỳ). Đây là nguồn dữ liệu phù hợp cho khai phá dữ liệu giáo dục (Educational Data Mining – EDM) và phân tích học tập (Learning Analytics – LA) [3].</w:t>
       </w:r>
     </w:p>
     <w:p>
@@ -3250,63 +3243,9 @@
         <w:pStyle w:val="Heading2"/>
       </w:pPr>
       <w:bookmarkStart w:id="6" w:name="_Toc241525747"/>
-      <w:bookmarkStart w:id="7" w:name="_Toc242916456"/>
-      <w:r>
-        <w:t>1.2. Tính c</w:t>
-      </w:r>
-      <w:r>
-        <w:t>ấ</w:t>
-      </w:r>
-      <w:r>
-        <w:t>p thi</w:t>
-      </w:r>
-      <w:r>
-        <w:t>ế</w:t>
-      </w:r>
-      <w:r>
-        <w:t>t xu</w:t>
-      </w:r>
-      <w:r>
-        <w:t>ấ</w:t>
-      </w:r>
-      <w:r>
-        <w:t>t phát t</w:t>
-      </w:r>
-      <w:r>
-        <w:t>ừ</w:t>
-      </w:r>
-      <w:r>
-        <w:t xml:space="preserve"> th</w:t>
-      </w:r>
-      <w:r>
-        <w:t>ự</w:t>
-      </w:r>
-      <w:r>
-        <w:t>c ti</w:t>
-      </w:r>
-      <w:r>
-        <w:t>ễ</w:t>
-      </w:r>
-      <w:r>
-        <w:t>n h</w:t>
-      </w:r>
-      <w:r>
-        <w:t>ọ</w:t>
-      </w:r>
-      <w:r>
-        <w:t>c sinh cu</w:t>
-      </w:r>
-      <w:r>
-        <w:t>ố</w:t>
-      </w:r>
-      <w:r>
-        <w:t>i c</w:t>
-      </w:r>
-      <w:r>
-        <w:t>ấ</w:t>
-      </w:r>
-      <w:r>
-        <w:t>p THCS</w:t>
+      <w:bookmarkStart w:id="7" w:name="_Toc242976253"/>
+      <w:r>
+        <w:t>1.2. Tính cấp thiết xuất phát từ thực tiễn học sinh cuối cấp THCS</w:t>
       </w:r>
       <w:bookmarkEnd w:id="6"/>
       <w:bookmarkEnd w:id="7"/>
@@ -3326,14 +3265,7 @@
           <w:rFonts w:eastAsia="Times New Roman"/>
           <w:sz w:val="26"/>
         </w:rPr>
-        <w:t>Lớp 9 là giai đoạn bản lề: học sinh hoàn thành chương trình THCS, chuẩn bị cho kỳ tuyển sinh lớp 10 và định hướng phân luồng. Trong thời gian ngắn của năm học cuối cấp, giáo viên chủ nhiệm và giáo viên bộ môn cần biết sớm học sinh nào có nguy cơ giảm sút và giảm ở môn nào. Học sinh cũng cần biết cụ thể mình nên ưu tiên ôn môn nào và cần cải thiện đến mức nào. Hiện nay các nhận định này chủ yếu dựa vào kinh nghiệm và việc đọc sổ điểm thủ công, nên khó phát hiện sớm xu hướng giảm dần qua nhiều học kỳ hoặc mối</w:t>
-      </w:r>
-      <w:r>
-        <w:rPr>
-          <w:rFonts w:eastAsia="Times New Roman"/>
-          <w:sz w:val="26"/>
-        </w:rPr>
-        <w:t xml:space="preserve"> liên hệ giữa các môn (ví dụ: nền tảng Toán yếu kéo theo KHTN giảm).</w:t>
+        <w:t>Lớp 9 là giai đoạn bản lề: học sinh hoàn thành chương trình THCS, chuẩn bị cho kỳ tuyển sinh lớp 10 và định hướng phân luồng. Trong thời gian ngắn của năm học cuối cấp, giáo viên chủ nhiệm và giáo viên bộ môn cần biết sớm học sinh nào có nguy cơ giảm sút và giảm ở môn nào. Học sinh cũng cần biết cụ thể mình nên ưu tiên ôn môn nào và cần cải thiện đến mức nào. Hiện nay các nhận định này chủ yếu dựa vào kinh nghiệm và việc đọc sổ điểm thủ công, nên khó phát hiện sớm xu hướng giảm dần qua nhiều học kỳ hoặc mối liên hệ giữa các môn (ví dụ: nền tảng Toán yếu kéo theo KHTN giảm).</w:t>
       </w:r>
     </w:p>
     <w:p>
@@ -3416,39 +3348,9 @@
         <w:pStyle w:val="Heading2"/>
       </w:pPr>
       <w:bookmarkStart w:id="8" w:name="_Toc241525748"/>
-      <w:bookmarkStart w:id="9" w:name="_Toc242916457"/>
-      <w:r>
-        <w:t>1.3. H</w:t>
-      </w:r>
-      <w:r>
-        <w:t>ạ</w:t>
-      </w:r>
-      <w:r>
-        <w:t>n ch</w:t>
-      </w:r>
-      <w:r>
-        <w:t>ế</w:t>
-      </w:r>
-      <w:r>
-        <w:t xml:space="preserve"> c</w:t>
-      </w:r>
-      <w:r>
-        <w:t>ủ</w:t>
-      </w:r>
-      <w:r>
-        <w:t>a các nghiên c</w:t>
-      </w:r>
-      <w:r>
-        <w:t>ứ</w:t>
-      </w:r>
-      <w:r>
-        <w:t>u hi</w:t>
-      </w:r>
-      <w:r>
-        <w:t>ệ</w:t>
-      </w:r>
-      <w:r>
-        <w:t>n có</w:t>
+      <w:bookmarkStart w:id="9" w:name="_Toc242976254"/>
+      <w:r>
+        <w:t>1.3. Hạn chế của các nghiên cứu hiện có</w:t>
       </w:r>
       <w:bookmarkEnd w:id="8"/>
       <w:bookmarkEnd w:id="9"/>
@@ -3673,7 +3575,7 @@
         <w:pStyle w:val="Heading1"/>
       </w:pPr>
       <w:bookmarkStart w:id="10" w:name="_Toc241525749"/>
-      <w:bookmarkStart w:id="11" w:name="_Toc242916458"/>
+      <w:bookmarkStart w:id="11" w:name="_Toc242976255"/>
       <w:r>
         <w:lastRenderedPageBreak/>
         <w:t>2. MỤC TIÊU NGHIÊN CỨU</w:t>
@@ -3686,21 +3588,9 @@
         <w:pStyle w:val="Heading2"/>
       </w:pPr>
       <w:bookmarkStart w:id="12" w:name="_Toc241525750"/>
-      <w:bookmarkStart w:id="13" w:name="_Toc242916459"/>
-      <w:r>
-        <w:t>2.1. M</w:t>
-      </w:r>
-      <w:r>
-        <w:t>ụ</w:t>
-      </w:r>
-      <w:r>
-        <w:t>c tiêu t</w:t>
-      </w:r>
-      <w:r>
-        <w:t>ổ</w:t>
-      </w:r>
-      <w:r>
-        <w:t>ng quát</w:t>
+      <w:bookmarkStart w:id="13" w:name="_Toc242976256"/>
+      <w:r>
+        <w:t>2.1. Mục tiêu tổng quát</w:t>
       </w:r>
       <w:bookmarkEnd w:id="12"/>
       <w:bookmarkEnd w:id="13"/>
@@ -3724,24 +3614,9 @@
         <w:pStyle w:val="Heading2"/>
       </w:pPr>
       <w:bookmarkStart w:id="14" w:name="_Toc241525751"/>
-      <w:bookmarkStart w:id="15" w:name="_Toc242916460"/>
-      <w:r>
-        <w:t>2.2. M</w:t>
-      </w:r>
-      <w:r>
-        <w:t>ụ</w:t>
-      </w:r>
-      <w:r>
-        <w:t>c tiêu c</w:t>
-      </w:r>
-      <w:r>
-        <w:t>ụ</w:t>
-      </w:r>
-      <w:r>
-        <w:t xml:space="preserve"> th</w:t>
-      </w:r>
-      <w:r>
-        <w:t>ể</w:t>
+      <w:bookmarkStart w:id="15" w:name="_Toc242976257"/>
+      <w:r>
+        <w:t>2.2. Mục tiêu cụ thể</w:t>
       </w:r>
       <w:bookmarkEnd w:id="14"/>
       <w:bookmarkEnd w:id="15"/>
@@ -3914,7 +3789,7 @@
         <w:pStyle w:val="Heading1"/>
       </w:pPr>
       <w:bookmarkStart w:id="16" w:name="_Toc241525752"/>
-      <w:bookmarkStart w:id="17" w:name="_Toc242916461"/>
+      <w:bookmarkStart w:id="17" w:name="_Toc242976258"/>
       <w:r>
         <w:t>3. TỔNG QUAN TÌNH HÌNH NGHIÊN CỨU</w:t>
       </w:r>
@@ -3926,57 +3801,9 @@
         <w:pStyle w:val="Heading2"/>
       </w:pPr>
       <w:bookmarkStart w:id="18" w:name="_Toc241525753"/>
-      <w:bookmarkStart w:id="19" w:name="_Toc242916462"/>
-      <w:r>
-        <w:t>3.1. D</w:t>
-      </w:r>
-      <w:r>
-        <w:t>ự</w:t>
-      </w:r>
-      <w:r>
-        <w:t xml:space="preserve"> đoán k</w:t>
-      </w:r>
-      <w:r>
-        <w:t>ế</w:t>
-      </w:r>
-      <w:r>
-        <w:t>t qu</w:t>
-      </w:r>
-      <w:r>
-        <w:t>ả</w:t>
-      </w:r>
-      <w:r>
-        <w:t xml:space="preserve"> h</w:t>
-      </w:r>
-      <w:r>
-        <w:t>ọ</w:t>
-      </w:r>
-      <w:r>
-        <w:t>c t</w:t>
-      </w:r>
-      <w:r>
-        <w:t>ậ</w:t>
-      </w:r>
-      <w:r>
-        <w:t>p và gi</w:t>
-      </w:r>
-      <w:r>
-        <w:t>ả</w:t>
-      </w:r>
-      <w:r>
-        <w:t>i thích h</w:t>
-      </w:r>
-      <w:r>
-        <w:t>ậ</w:t>
-      </w:r>
-      <w:r>
-        <w:t>u nghi</w:t>
-      </w:r>
-      <w:r>
-        <w:t>ệ</w:t>
-      </w:r>
-      <w:r>
-        <w:t>m</w:t>
+      <w:bookmarkStart w:id="19" w:name="_Toc242976259"/>
+      <w:r>
+        <w:t>3.1. Dự đoán kết quả học tập và giải thích hậu nghiệm</w:t>
       </w:r>
       <w:bookmarkEnd w:id="18"/>
       <w:bookmarkEnd w:id="19"/>
@@ -3992,14 +3819,7 @@
           <w:rFonts w:eastAsia="Times New Roman"/>
           <w:sz w:val="26"/>
         </w:rPr>
-        <w:t>Hướng tiếp cận phổ biến giai đoạn 2022–2025 là kết hợp mô hình dự đoán với phương pháp giải thích hậu nghiệm. Yağcı [28] dùng điểm giữa kỳ để dự đoán điểm cuối kỳ của 1.854 sinh viên, đạt độ chính xác khoảng 74,6%. Huang và cộng sự [12] phân tích dữ liệu PISA 2022 của 34.495 học sinh trung học cơ sở ở sáu hệ thống giáo dục Đông Á; SHAP chỉ ra rằng niềm tin vào năng lực toán học là yếu tố ảnh hưởng mạnh nhất. Ở bài toán hồi quy, Wang và Luo [13] đạt MAE khoảng 6 (thang 100) và R² ≈ 0,82; Ghimire và cộng sự [</w:t>
-      </w:r>
-      <w:r>
-        <w:rPr>
-          <w:rFonts w:eastAsia="Times New Roman"/>
-          <w:sz w:val="26"/>
-        </w:rPr>
-        <w:t>29] dự đoán điểm tổng kết học phần từ điểm thành phần; Ahmed và cộng sự [15] dùng mô hình kết hợp và báo cáo RMSE cùng R² kèm giải thích LIME/SHAP. Johora và cộng sự [14] đạt độ chính xác 86,38% với mô hình xếp chồng kết hợp SHAP và LIME. Điểm chung của nhóm này là dữ liệu đầu vào dạng vector phẳng và phần giải thích dừng ở mức xếp hạng tầm quan trọng của đặc trưng.</w:t>
+        <w:t>Hướng tiếp cận phổ biến giai đoạn 2022–2025 là kết hợp mô hình dự đoán với phương pháp giải thích hậu nghiệm. Yağcı [28] dùng điểm giữa kỳ để dự đoán điểm cuối kỳ của 1.854 sinh viên, đạt độ chính xác khoảng 74,6%. Huang và cộng sự [12] phân tích dữ liệu PISA 2022 của 34.495 học sinh trung học cơ sở ở sáu hệ thống giáo dục Đông Á; SHAP chỉ ra rằng niềm tin vào năng lực toán học là yếu tố ảnh hưởng mạnh nhất. Ở bài toán hồi quy, Wang và Luo [13] đạt MAE khoảng 6 (thang 100) và R² ≈ 0,82; Ghimire và cộng sự [29] dự đoán điểm tổng kết học phần từ điểm thành phần; Ahmed và cộng sự [15] dùng mô hình kết hợp và báo cáo RMSE cùng R² kèm giải thích LIME/SHAP. Johora và cộng sự [14] đạt độ chính xác 86,38% với mô hình xếp chồng kết hợp SHAP và LIME. Điểm chung của nhóm này là dữ liệu đầu vào dạng vector phẳng và phần giải thích dừng ở mức xếp hạng tầm quan trọng của đặc trưng.</w:t>
       </w:r>
     </w:p>
     <w:p>
@@ -4007,7 +3827,7 @@
         <w:pStyle w:val="Heading2"/>
       </w:pPr>
       <w:bookmarkStart w:id="20" w:name="_Toc241525754"/>
-      <w:bookmarkStart w:id="21" w:name="_Toc242916463"/>
+      <w:bookmarkStart w:id="21" w:name="_Toc242976260"/>
       <w:r>
         <w:rPr>
           <w:rFonts w:eastAsia="Times New Roman"/>
@@ -4028,14 +3848,7 @@
           <w:rFonts w:eastAsia="Times New Roman"/>
           <w:sz w:val="26"/>
         </w:rPr>
-        <w:t xml:space="preserve">Nhằm khai thác tính chuỗi của dữ liệu, Chen và cộng sự [16] dùng CNN-LSTM trên dữ liệu hoạt động theo tuần của OULAD; Waheed và cộng sự [17] dùng LSTM trên 22.437 người học, đạt độ chính xác 84,57%. Kalita và cộng sự [18] kết hợp Bi-LSTM với SHAP để dự đoán điểm trung bình học kỳ, đạt 88,23% và vượt các mô hình tăng cường gradient có kiểm định thống kê. Liu và cộng sự [19] đề xuất mô hình MCAG dùng cơ chế chú ý để gán trọng số thuộc tính, đạt 94,22%; Yang và cộng sự [30] kết hợp siêu đồ thị với TabNet, đạt </w:t>
-      </w:r>
-      <w:r>
-        <w:rPr>
-          <w:rFonts w:eastAsia="Times New Roman"/>
-          <w:sz w:val="26"/>
-        </w:rPr>
-        <w:t>F1 = 93,10%. Ở mức chi tiết hơn, các mô hình truy vết tri thức như DKT và AKT [31], [32] dự đoán kết quả theo từng câu hỏi, phù hợp cho hệ thống học trực tuyến nhưng khó áp dụng cho sổ điểm tổng hợp theo học kỳ của trường phổ thông.</w:t>
+        <w:t>Nhằm khai thác tính chuỗi của dữ liệu, Chen và cộng sự [16] dùng CNN-LSTM trên dữ liệu hoạt động theo tuần của OULAD; Waheed và cộng sự [17] dùng LSTM trên 22.437 người học, đạt độ chính xác 84,57%. Kalita và cộng sự [18] kết hợp Bi-LSTM với SHAP để dự đoán điểm trung bình học kỳ, đạt 88,23% và vượt các mô hình tăng cường gradient có kiểm định thống kê. Liu và cộng sự [19] đề xuất mô hình MCAG dùng cơ chế chú ý để gán trọng số thuộc tính, đạt 94,22%; Yang và cộng sự [30] kết hợp siêu đồ thị với TabNet, đạt F1 = 93,10%. Ở mức chi tiết hơn, các mô hình truy vết tri thức như DKT và AKT [31], [32] dự đoán kết quả theo từng câu hỏi, phù hợp cho hệ thống học trực tuyến nhưng khó áp dụng cho sổ điểm tổng hợp theo học kỳ của trường phổ thông.</w:t>
       </w:r>
     </w:p>
     <w:p>
@@ -4043,7 +3856,7 @@
         <w:pStyle w:val="Heading2"/>
       </w:pPr>
       <w:bookmarkStart w:id="22" w:name="_Toc241525755"/>
-      <w:bookmarkStart w:id="23" w:name="_Toc242916464"/>
+      <w:bookmarkStart w:id="23" w:name="_Toc242976261"/>
       <w:r>
         <w:rPr>
           <w:rFonts w:eastAsia="Times New Roman"/>
@@ -4064,14 +3877,7 @@
           <w:rFonts w:eastAsia="Times New Roman"/>
           <w:sz w:val="26"/>
         </w:rPr>
-        <w:t xml:space="preserve">TabTransformer [5] và FT-Transformer [6] biến mỗi đặc trưng thành một token để self-attention học tương tác giữa các đặc trưng; TabNet [33] dùng cơ chế chú ý tuần tự để chọn đặc trưng. Grinsztajn và cộng sự [34] chỉ ra rằng trên nhiều bộ dữ liệu bảng thông thường, mô hình dạng cây vẫn là đối thủ khó vượt. Đây là thách thức mà các thiết kế học sâu mới phải giải quyết bằng cách khai thác cấu trúc riêng của dữ liệu. TabPFN [7], một mô hình nền tảng được huấn luyện trước trên dữ liệu </w:t>
-      </w:r>
-      <w:r>
-        <w:rPr>
-          <w:rFonts w:eastAsia="Times New Roman"/>
-          <w:sz w:val="26"/>
-        </w:rPr>
-        <w:t>tổng hợp, đạt kết quả vượt trội trên dữ liệu nhỏ và là mô hình cơ sở mạnh cho các bộ dữ liệu giáo dục vài nghìn mẫu.</w:t>
+        <w:t>TabTransformer [5] và FT-Transformer [6] biến mỗi đặc trưng thành một token để self-attention học tương tác giữa các đặc trưng; TabNet [33] dùng cơ chế chú ý tuần tự để chọn đặc trưng. Grinsztajn và cộng sự [34] chỉ ra rằng trên nhiều bộ dữ liệu bảng thông thường, mô hình dạng cây vẫn là đối thủ khó vượt. Đây là thách thức mà các thiết kế học sâu mới phải giải quyết bằng cách khai thác cấu trúc riêng của dữ liệu. TabPFN [7], một mô hình nền tảng được huấn luyện trước trên dữ liệu tổng hợp, đạt kết quả vượt trội trên dữ liệu nhỏ và là mô hình cơ sở mạnh cho các bộ dữ liệu giáo dục vài nghìn mẫu.</w:t>
       </w:r>
     </w:p>
     <w:p>
@@ -4085,14 +3891,7 @@
           <w:rFonts w:eastAsia="Times New Roman"/>
           <w:sz w:val="26"/>
         </w:rPr>
-        <w:t>KAN [8] đặt các hàm kích hoạt học được lên cạnh thay cho nút mạng, nhờ đó mỗi hàm một biến có thể được vẽ ra và diễn giải. KAT [9] thay khối MLP của Transformer bằng lớp GR-KAN (group-rational KAN) để giữ hiệu năng khi mở rộng quy mô. Trên dữ liệu bảng, TabKAN [35] vượt các mô hình GBDT và Transformer trên tám bộ dữ liệu chuẩn; TabKANet [36] dùng KAN để nhúng đặc trưng số trước khi đưa vào Transformer. Trong giáo dục, Kanformer [21] kết hợp multi-head attention với lớp KAN trên OULAD (32.593 người học), đạt</w:t>
-      </w:r>
-      <w:r>
-        <w:rPr>
-          <w:rFonts w:eastAsia="Times New Roman"/>
-          <w:sz w:val="26"/>
-        </w:rPr>
-        <w:t xml:space="preserve"> 99,21% ở bài toán nhị phân; tại Việt Nam, mô hình LAGT [22] kết hợp GCN và Transformer dự đoán xếp loại tốt nghiệp đại học, đạt 92,73%. Về thiết kế cho dữ liệu nhiều chiều, chú ý theo trục (axial attention) [37] tách phép chú ý theo từng chiều để giảm chi phí; Temporal Fusion Transformer [38] cho thấy Transformer có thể được thiết kế để vừa dự báo chuỗi thời gian vừa diễn giải được.</w:t>
+        <w:t>KAN [8] đặt các hàm kích hoạt học được lên cạnh thay cho nút mạng, nhờ đó mỗi hàm một biến có thể được vẽ ra và diễn giải. KAT [9] thay khối MLP của Transformer bằng lớp GR-KAN (group-rational KAN) để giữ hiệu năng khi mở rộng quy mô. Trên dữ liệu bảng, TabKAN [35] vượt các mô hình GBDT và Transformer trên tám bộ dữ liệu chuẩn; TabKANet [36] dùng KAN để nhúng đặc trưng số trước khi đưa vào Transformer. Trong giáo dục, Kanformer [21] kết hợp multi-head attention với lớp KAN trên OULAD (32.593 người học), đạt 99,21% ở bài toán nhị phân; tại Việt Nam, mô hình LAGT [22] kết hợp GCN và Transformer dự đoán xếp loại tốt nghiệp đại học, đạt 92,73%. Về thiết kế cho dữ liệu nhiều chiều, chú ý theo trục (axial attention) [37] tách phép chú ý theo từng chiều để giảm chi phí; Temporal Fusion Transformer [38] cho thấy Transformer có thể được thiết kế để vừa dự báo chuỗi thời gian vừa diễn giải được.</w:t>
       </w:r>
     </w:p>
     <w:p>
@@ -4100,7 +3899,7 @@
         <w:pStyle w:val="Heading2"/>
       </w:pPr>
       <w:bookmarkStart w:id="24" w:name="_Toc241525756"/>
-      <w:bookmarkStart w:id="25" w:name="_Toc242916465"/>
+      <w:bookmarkStart w:id="25" w:name="_Toc242976262"/>
       <w:r>
         <w:rPr>
           <w:rFonts w:eastAsia="Times New Roman"/>
@@ -4125,14 +3924,7 @@
           <w:rFonts w:eastAsia="Times New Roman"/>
           <w:sz w:val="26"/>
         </w:rPr>
-        <w:t>SHAP [39] dựa trên giá trị Shapley và Integrated Gradients [40] dựa trên tích phân gradient là hai phương pháp quy kết đặc trưng có nền tảng tiên đề. Với Transformer, attention rollout [41] lan truyền trọng số chú ý qua các lớp, nhưng cần kiểm chứng vì attention không đồng nghĩa với lời giải thích [20]. Rudin [42] lập luận rằng trong các quyết định quan trọng nên ưu tiên mô hình có tính diễn giải nội tại. Đây chính là động lực để đưa KAN vào khung đề xuất. Khosravi và cộng sự [23] xây dựng khung XAI-ED, nhấ</w:t>
-      </w:r>
-      <w:r>
-        <w:rPr>
-          <w:rFonts w:eastAsia="Times New Roman"/>
-          <w:sz w:val="26"/>
-        </w:rPr>
-        <w:t>n mạnh rằng lời giải thích trong giáo dục phải phục vụ người dùng cụ thể và dẫn tới hành động.</w:t>
+        <w:t>SHAP [39] dựa trên giá trị Shapley và Integrated Gradients [40] dựa trên tích phân gradient là hai phương pháp quy kết đặc trưng có nền tảng tiên đề. Với Transformer, attention rollout [41] lan truyền trọng số chú ý qua các lớp, nhưng cần kiểm chứng vì attention không đồng nghĩa với lời giải thích [20]. Rudin [42] lập luận rằng trong các quyết định quan trọng nên ưu tiên mô hình có tính diễn giải nội tại. Đây chính là động lực để đưa KAN vào khung đề xuất. Khosravi và cộng sự [23] xây dựng khung XAI-ED, nhấn mạnh rằng lời giải thích trong giáo dục phải phục vụ người dùng cụ thể và dẫn tới hành động.</w:t>
       </w:r>
     </w:p>
     <w:p>
@@ -4146,14 +3938,7 @@
           <w:rFonts w:eastAsia="Times New Roman"/>
           <w:sz w:val="26"/>
         </w:rPr>
-        <w:t>Giải thích phản thực trả lời câu hỏi “cần thay đổi gì để kết quả khác đi”; DiCE [43] sinh nhiều phương án phản thực đa dạng. Buñay-Guisñan và cộng sự [24] áp dụng phản thực theo nhóm cho học sinh có nguy cơ bỏ học trực tuyến và đạt tỷ lệ “phục hồi” 99,3%. Swamy và cộng sự [25] đề xuất iLLuMinaTE, dùng LLM chuyển kết quả XAI thành phản hồi dựa trên lý thuyết giải thích của khoa học xã hội; 89,52% lựa chọn của người học ưu tiên phản hồi này. Về độ bất định, dự đoán conformal [44] tạo khoảng dự đoán có bảo đảm</w:t>
-      </w:r>
-      <w:r>
-        <w:rPr>
-          <w:rFonts w:eastAsia="Times New Roman"/>
-          <w:sz w:val="26"/>
-        </w:rPr>
-        <w:t xml:space="preserve"> độ phủ mà không cần giả định phân phối. Tuy nhiên, chưa ghi nhận công trình nào áp dụng phương pháp này cho bài toán dự đoán điểm của học sinh phổ thông.</w:t>
+        <w:t>Giải thích phản thực trả lời câu hỏi “cần thay đổi gì để kết quả khác đi”; DiCE [43] sinh nhiều phương án phản thực đa dạng. Buñay-Guisñan và cộng sự [24] áp dụng phản thực theo nhóm cho học sinh có nguy cơ bỏ học trực tuyến và đạt tỷ lệ “phục hồi” 99,3%. Swamy và cộng sự [25] đề xuất iLLuMinaTE, dùng LLM chuyển kết quả XAI thành phản hồi dựa trên lý thuyết giải thích của khoa học xã hội; 89,52% lựa chọn của người học ưu tiên phản hồi này. Về độ bất định, dự đoán conformal [44] tạo khoảng dự đoán có bảo đảm độ phủ mà không cần giả định phân phối. Tuy nhiên, chưa ghi nhận công trình nào áp dụng phương pháp này cho bài toán dự đoán điểm của học sinh phổ thông.</w:t>
       </w:r>
     </w:p>
     <w:p>
@@ -4161,7 +3946,7 @@
         <w:pStyle w:val="Heading2"/>
       </w:pPr>
       <w:bookmarkStart w:id="26" w:name="_Toc241525757"/>
-      <w:bookmarkStart w:id="27" w:name="_Toc242916466"/>
+      <w:bookmarkStart w:id="27" w:name="_Toc242976263"/>
       <w:r>
         <w:rPr>
           <w:rFonts w:eastAsia="Times New Roman"/>
@@ -4182,14 +3967,7 @@
           <w:rFonts w:eastAsia="Times New Roman"/>
           <w:sz w:val="26"/>
         </w:rPr>
-        <w:t>Pham và cộng sự [26] xây dựng khung MLOps hướng dữ liệu cho 2.283 học sinh THPT Việt Nam, dự đoán điểm lớp 12 và kết quả thi tốt nghiệp bằng hồi quy tuyến tính, MLP và LSTM; việc bổ sung bối cảnh kinh tế – xã hội cải thiện độ chính xác cho nhóm học sinh yếu thế. Le và cộng sự [27] dự đoán kết quả học tập của 174 học sinh lớp 10 người Khmer và Hoa tại Sóc Trăng. Son và cộng sự [22] dùng dữ liệu ba trường đại học với mô hình GCN-Transformer. Như vậy, bậc THCS và đặc biệt là học sinh lớp 9 còn ít được nghiên c</w:t>
-      </w:r>
-      <w:r>
-        <w:rPr>
-          <w:rFonts w:eastAsia="Times New Roman"/>
-          <w:sz w:val="26"/>
-        </w:rPr>
-        <w:t>ứu, trong khi đây là giai đoạn có nhu cầu hỗ trợ ôn tập và định hướng cao.</w:t>
+        <w:t>Pham và cộng sự [26] xây dựng khung MLOps hướng dữ liệu cho 2.283 học sinh THPT Việt Nam, dự đoán điểm lớp 12 và kết quả thi tốt nghiệp bằng hồi quy tuyến tính, MLP và LSTM; việc bổ sung bối cảnh kinh tế – xã hội cải thiện độ chính xác cho nhóm học sinh yếu thế. Le và cộng sự [27] dự đoán kết quả học tập của 174 học sinh lớp 10 người Khmer và Hoa tại Sóc Trăng. Son và cộng sự [22] dùng dữ liệu ba trường đại học với mô hình GCN-Transformer. Như vậy, bậc THCS và đặc biệt là học sinh lớp 9 còn ít được nghiên cứu, trong khi đây là giai đoạn có nhu cầu hỗ trợ ôn tập và định hướng cao.</w:t>
       </w:r>
     </w:p>
     <w:p>
@@ -4197,7 +3975,7 @@
         <w:pStyle w:val="Heading2"/>
       </w:pPr>
       <w:bookmarkStart w:id="28" w:name="_Toc241525758"/>
-      <w:bookmarkStart w:id="29" w:name="_Toc242916467"/>
+      <w:bookmarkStart w:id="29" w:name="_Toc242976264"/>
       <w:r>
         <w:rPr>
           <w:rFonts w:eastAsia="Times New Roman"/>
@@ -5306,7 +5084,7 @@
         <w:pStyle w:val="Heading1"/>
       </w:pPr>
       <w:bookmarkStart w:id="30" w:name="_Toc241525759"/>
-      <w:bookmarkStart w:id="31" w:name="_Toc242916468"/>
+      <w:bookmarkStart w:id="31" w:name="_Toc242976265"/>
       <w:r>
         <w:t>4. ĐỐI TƯỢNG VÀ PHẠM VI NGHIÊN CỨU</w:t>
       </w:r>
@@ -5318,7 +5096,7 @@
         <w:pStyle w:val="Heading2"/>
       </w:pPr>
       <w:bookmarkStart w:id="32" w:name="_Toc241525760"/>
-      <w:bookmarkStart w:id="33" w:name="_Toc242916469"/>
+      <w:bookmarkStart w:id="33" w:name="_Toc242976266"/>
       <w:r>
         <w:rPr>
           <w:rFonts w:eastAsia="Times New Roman"/>
@@ -5375,7 +5153,7 @@
         <w:pStyle w:val="Heading2"/>
       </w:pPr>
       <w:bookmarkStart w:id="34" w:name="_Toc241525761"/>
-      <w:bookmarkStart w:id="35" w:name="_Toc242916470"/>
+      <w:bookmarkStart w:id="35" w:name="_Toc242976267"/>
       <w:r>
         <w:rPr>
           <w:rFonts w:eastAsia="Times New Roman"/>
@@ -5432,14 +5210,7 @@
           <w:rFonts w:eastAsia="Times New Roman"/>
           <w:sz w:val="26"/>
         </w:rPr>
-        <w:t>Dữ liệu: (i) dữ liệu chính là sổ điểm tổng hợp của một khóa học sinh Trường THCS Phú An (thành phố Bến Cát) được theo dõi dọc bốn năm học, từ lớp 6 (2022–2023) đến lớp 9 (2025–2026), gồm 12 sổ điểm: học kỳ I, học kỳ II và cả năm của mỗi lớp; 613 học sinh xuất hiện ít nhất một năm, 449 học sinh có đủ bốn năm; mỗi sổ ghi điểm trung bình 8 môn đánh giá bằng điểm số (Toán, Ngữ văn, Tiếng Anh, Khoa học tự nhiên, Lịch sử và Địa lí, Giáo dục công dân, Công nghệ, Tin học), kết quả các môn đánh giá bằng nhận xét, kế</w:t>
-      </w:r>
-      <w:r>
-        <w:rPr>
-          <w:rFonts w:eastAsia="Times New Roman"/>
-          <w:sz w:val="26"/>
-        </w:rPr>
-        <w:t>t quả học tập và rèn luyện theo Thông tư 22, số buổi nghỉ có phép và không phép; dữ liệu được ẩn danh trước khi đưa vào nghiên cứu; (ii) dữ liệu bổ sung là bộ dữ liệu công khai Student Performance (UCI) của học sinh trung học Bồ Đào Nha [45], chỉ dùng để kiểm chứng khả năng tái lập và tổng quát hóa của mô hình. Các thuộc tính nhạy cảm (giới tính, dân tộc, hoàn cảnh gia đình) không được dùng làm đầu vào dự đoán mà chỉ dùng để kiểm tra tính công bằng khi nhà trường cung cấp.</w:t>
+        <w:t>Dữ liệu: (i) dữ liệu chính là sổ điểm tổng hợp của một khóa học sinh Trường THCS Phú An (thành phố Bến Cát) được theo dõi dọc bốn năm học, từ lớp 6 (2022–2023) đến lớp 9 (2025–2026), gồm 12 sổ điểm: học kỳ I, học kỳ II và cả năm của mỗi lớp; 613 học sinh xuất hiện ít nhất một năm, 449 học sinh có đủ bốn năm; mỗi sổ ghi điểm trung bình 8 môn đánh giá bằng điểm số (Toán, Ngữ văn, Tiếng Anh, Khoa học tự nhiên, Lịch sử và Địa lí, Giáo dục công dân, Công nghệ, Tin học), kết quả các môn đánh giá bằng nhận xét, kết quả học tập và rèn luyện theo Thông tư 22, số buổi nghỉ có phép và không phép; dữ liệu được ẩn danh trước khi đưa vào nghiên cứu; (ii) dữ liệu bổ sung là bộ dữ liệu công khai Student Performance (UCI) của học sinh trung học Bồ Đào Nha [45], chỉ dùng để kiểm chứng khả năng tái lập và tổng quát hóa của mô hình. Các thuộc tính nhạy cảm (giới tính, dân tộc, hoàn cảnh gia đình) không được dùng làm đầu vào dự đoán mà chỉ dùng để kiểm tra tính công bằng khi nhà trường cung cấp.</w:t>
       </w:r>
     </w:p>
     <w:p>
@@ -5507,7 +5278,7 @@
         <w:pStyle w:val="Heading1"/>
       </w:pPr>
       <w:bookmarkStart w:id="36" w:name="_Toc241525762"/>
-      <w:bookmarkStart w:id="37" w:name="_Toc242916471"/>
+      <w:bookmarkStart w:id="37" w:name="_Toc242976268"/>
       <w:r>
         <w:t>5. PHƯƠNG PHÁP NGHIÊN CỨU</w:t>
       </w:r>
@@ -5519,7 +5290,7 @@
         <w:pStyle w:val="Heading2"/>
       </w:pPr>
       <w:bookmarkStart w:id="38" w:name="_Toc241525763"/>
-      <w:bookmarkStart w:id="39" w:name="_Toc242916472"/>
+      <w:bookmarkStart w:id="39" w:name="_Toc242976269"/>
       <w:r>
         <w:rPr>
           <w:rFonts w:eastAsia="Times New Roman"/>
@@ -5548,7 +5319,7 @@
         <w:pStyle w:val="Heading2"/>
       </w:pPr>
       <w:bookmarkStart w:id="40" w:name="_Toc241525764"/>
-      <w:bookmarkStart w:id="41" w:name="_Toc242916473"/>
+      <w:bookmarkStart w:id="41" w:name="_Toc242976270"/>
       <w:r>
         <w:rPr>
           <w:rFonts w:eastAsia="Times New Roman"/>
@@ -5577,7 +5348,7 @@
         <w:pStyle w:val="Heading2"/>
       </w:pPr>
       <w:bookmarkStart w:id="42" w:name="_Toc241525765"/>
-      <w:bookmarkStart w:id="43" w:name="_Toc242916474"/>
+      <w:bookmarkStart w:id="43" w:name="_Toc242976271"/>
       <w:r>
         <w:rPr>
           <w:rFonts w:eastAsia="Times New Roman"/>
@@ -5671,21 +5442,7 @@
           <w:rFonts w:eastAsia="Times New Roman"/>
           <w:sz w:val="26"/>
         </w:rPr>
-        <w:t>trong đó S là số môn đánh giá bằng điểm số và T = 7 học kỳ (từ học kỳ I lớp 6 đến học kỳ I lớp 9), kèm vector đặc trưng tĩnh (kết quả rèn luyện, số buổi nghỉ học). Quy trình tiền xử lý gồm: ẩn danh hóa mã học sinh và loại bỏ thông tin định danh theo Luật 91/2025/QH15 [11]; chuẩn hóa thang điểm; dùng mặt nạ cho giá trị khuyết thay vì điền giá trị giả; nhận diện loại sổ (học kỳ I, học kỳ II, cả năm) từ tiêu đề bảng điểm và nối dữ liệu từng học sinh qua các năm bằng mã học sinh. Để tăng số mẫu, ngoài cửa sổ “h</w:t>
-      </w:r>
-      <w:r>
-        <w:rPr>
-          <w:rFonts w:eastAsia="Times New Roman"/>
-          <w:sz w:val="26"/>
-        </w:rPr>
-        <w:t>ọc kỳ I lớp 6 → học kỳ I lớp 9 dự đoán cả năm lớp 9”, mô hình còn học các cửa sổ dự đoán cả năm lớp 7 và lớp 8 từ các học kỳ trước đó (các mốc tương lai bị che); chỉ cửa sổ mục tiêu lớp 9 được dùng để đánh giá. Do dữ liệu là một khóa học sinh, tập dữ liệu được chia bằng kiểm định chéo 5 lần theo nhóm lớp học, lặp với 3 hạt giống ngẫu nhiên, mọi cửa sổ của một học sinh luôn nằm cùng một phần để tránh rò rỉ thông tin; khi có thêm khóa mới, phương án huấn luyện trên các khóa trước và kiểm thử trên khóa gần nhấ</w:t>
-      </w:r>
-      <w:r>
-        <w:rPr>
-          <w:rFonts w:eastAsia="Times New Roman"/>
-          <w:sz w:val="26"/>
-        </w:rPr>
-        <w:t>t sẽ được bổ sung.</w:t>
+        <w:t>trong đó S là số môn đánh giá bằng điểm số và T = 7 học kỳ (từ học kỳ I lớp 6 đến học kỳ I lớp 9), kèm vector đặc trưng tĩnh (kết quả rèn luyện, số buổi nghỉ học). Quy trình tiền xử lý gồm: ẩn danh hóa mã học sinh và loại bỏ thông tin định danh theo Luật 91/2025/QH15 [11]; chuẩn hóa thang điểm; dùng mặt nạ cho giá trị khuyết thay vì điền giá trị giả; nhận diện loại sổ (học kỳ I, học kỳ II, cả năm) từ tiêu đề bảng điểm và nối dữ liệu từng học sinh qua các năm bằng mã học sinh. Để tăng số mẫu, ngoài cửa sổ “học kỳ I lớp 6 → học kỳ I lớp 9 dự đoán cả năm lớp 9”, mô hình còn học các cửa sổ dự đoán cả năm lớp 7 và lớp 8 từ các học kỳ trước đó (các mốc tương lai bị che); chỉ cửa sổ mục tiêu lớp 9 được dùng để đánh giá. Do dữ liệu là một khóa học sinh, tập dữ liệu được chia bằng kiểm định chéo 5 lần theo nhóm lớp học, lặp với 3 hạt giống ngẫu nhiên, mọi cửa sổ của một học sinh luôn nằm cùng một phần để tránh rò rỉ thông tin; khi có thêm khóa mới, phương án huấn luyện trên các khóa trước và kiểm thử trên khóa gần nhất sẽ được bổ sung.</w:t>
       </w:r>
     </w:p>
     <w:p>
@@ -5693,7 +5450,7 @@
         <w:pStyle w:val="Heading2"/>
       </w:pPr>
       <w:bookmarkStart w:id="44" w:name="_Toc241525766"/>
-      <w:bookmarkStart w:id="45" w:name="_Toc242916475"/>
+      <w:bookmarkStart w:id="45" w:name="_Toc242976272"/>
       <w:r>
         <w:rPr>
           <w:rFonts w:eastAsia="Times New Roman"/>
@@ -6692,7 +6449,7 @@
         <w:pStyle w:val="Heading2"/>
       </w:pPr>
       <w:bookmarkStart w:id="46" w:name="_Toc241525767"/>
-      <w:bookmarkStart w:id="47" w:name="_Toc242916476"/>
+      <w:bookmarkStart w:id="47" w:name="_Toc242976273"/>
       <w:r>
         <w:rPr>
           <w:rFonts w:eastAsia="Times New Roman"/>
@@ -6812,21 +6569,7 @@
           <w:rFonts w:eastAsia="Times New Roman"/>
           <w:sz w:val="26"/>
         </w:rPr>
-        <w:t>Với những học sinh có năng lực ba môn thi Toán – Ngữ văn – Tiếng Anh chưa cao và khó cạnh tranh suất vào THPT công lập (xác định bằng cách so tổng điểm ba môn với điểm sàn tuyển sinh của trường THPT mục tiêu), tầng giải thích được mở rộng theo ba hướng: (1) Tìm “điểm sáng” từ điểm toàn diện: hệ thống quét toàn bộ các môn còn lại theo Thông tư 22 để phát hiện những môn học sinh có kết quả tốt (Công nghệ, Tin học, Khoa học tự nhiên, Mỹ thuật, Thể dục…), ghi nhận đúng thế mạnh thực tế của từng em thay vì chỉ n</w:t>
-      </w:r>
-      <w:r>
-        <w:rPr>
-          <w:rFonts w:eastAsia="Times New Roman"/>
-          <w:sz w:val="26"/>
-        </w:rPr>
-        <w:t>hìn vào ba môn thi. (2) Gửi thông điệp nhẹ nhàng, giải tỏa áp lực thi cử: LLM cục bộ được ràng buộc bằng bộ quy tắc ngôn từ ấm áp, tuyệt đối không dùng các từ tiêu cực như “học kém”, “trượt”; thông điệp định hướng rõ rằng thi THPT công lập không phải con đường duy nhất để thành công, các trường trung cấp và cao đẳng nghề là lựa chọn phù hợp với thế mạnh thực hành của các em. (3) Động viên hoàn thành mục tiêu tốt nghiệp THCS (không bỏ lại ai phía sau): thông điệp không làm học sinh buông xuôi, mà nhắc nhở và</w:t>
-      </w:r>
-      <w:r>
-        <w:rPr>
-          <w:rFonts w:eastAsia="Times New Roman"/>
-          <w:sz w:val="26"/>
-        </w:rPr>
-        <w:t xml:space="preserve"> động viên các em duy trì sức học ở học kỳ II để kết quả học tập và rèn luyện lớp 9 đạt từ mức Đạt trở lên – điều kiện tiên quyết để xét tốt nghiệp THCS và đăng ký xét tuyển vào các trường nghề. Mọi thông điệp đều qua hàng rào kiểm soát tự động (từ ngữ, số liệu phải khớp dữ kiện đã tính) và được giáo viên duyệt trước khi gửi.</w:t>
+        <w:t>Với những học sinh có năng lực ba môn thi Toán – Ngữ văn – Tiếng Anh chưa cao và khó cạnh tranh suất vào THPT công lập (xác định bằng cách so tổng điểm ba môn với điểm sàn tuyển sinh của trường THPT mục tiêu), tầng giải thích được mở rộng theo ba hướng: (1) Tìm “điểm sáng” từ điểm toàn diện: hệ thống quét toàn bộ các môn còn lại theo Thông tư 22 để phát hiện những môn học sinh có kết quả tốt (Công nghệ, Tin học, Khoa học tự nhiên, Mỹ thuật, Thể dục…), ghi nhận đúng thế mạnh thực tế của từng em thay vì chỉ nhìn vào ba môn thi. (2) Gửi thông điệp nhẹ nhàng, giải tỏa áp lực thi cử: LLM cục bộ được ràng buộc bằng bộ quy tắc ngôn từ ấm áp, tuyệt đối không dùng các từ tiêu cực như “học kém”, “trượt”; thông điệp định hướng rõ rằng thi THPT công lập không phải con đường duy nhất để thành công, các trường trung cấp và cao đẳng nghề là lựa chọn phù hợp với thế mạnh thực hành của các em. (3) Động viên hoàn thành mục tiêu tốt nghiệp THCS (không bỏ lại ai phía sau): thông điệp không làm học sinh buông xuôi, mà nhắc nhở và động viên các em duy trì sức học ở học kỳ II để kết quả học tập và rèn luyện lớp 9 đạt từ mức Đạt trở lên – điều kiện tiên quyết để xét tốt nghiệp THCS và đăng ký xét tuyển vào các trường nghề. Mọi thông điệp đều qua hàng rào kiểm soát tự động (từ ngữ, số liệu phải khớp dữ kiện đã tính) và được giáo viên duyệt trước khi gửi.</w:t>
       </w:r>
     </w:p>
     <w:p>
@@ -6846,16 +6589,7 @@
           <w:iCs/>
           <w:sz w:val="26"/>
         </w:rPr>
-        <w:t xml:space="preserve">Ví dụ thông điệp hệ thống gửi cho học sinh thuộc nhóm định hướng nghề (do LLM cục bộ sinh từ dữ kiện đã tính, giáo viên đã duyệt): “Chào em, kết quả học tập HK I cho thấy em có năng lực rất tốt ở môn Công nghệ (8,5) và Tin học (8,0) – đây là những kỹ năng thực hành tuyệt vời! Dù môn Toán và Tiếng Anh có thể đang là thử thách với em trong kỳ thi vào 10, em hãy nhớ rằng thi THPT không phải là con đường duy nhất. Rất nhiều trường Trung cấp và Cao đẳng nghề đào tạo Công nghệ/Kỹ thuật đang mở rộng cửa đón những </w:t>
-      </w:r>
-      <w:r>
-        <w:rPr>
-          <w:rFonts w:eastAsia="Times New Roman"/>
-          <w:i/>
-          <w:iCs/>
-          <w:sz w:val="26"/>
-        </w:rPr>
-        <w:t>học sinh có thế mạnh thực hành như em. Mục tiêu quan trọng nhất của em ở HK II: tiếp tục cố gắng hoàn thành tốt các môn học còn lại để đạt kết quả tốt nghiệp THCS thật đẹp. Tấm bằng THCS chính là tấm vé giúp em vững vàng bước vào trường nghề mơ ước. Thầy cô luôn tin tưởng và đồng hành cùng em!”</w:t>
+        <w:t>Ví dụ thông điệp hệ thống gửi cho học sinh thuộc nhóm định hướng nghề (do LLM cục bộ sinh từ dữ kiện đã tính, giáo viên đã duyệt): “Chào em, kết quả học tập HK I cho thấy em có năng lực rất tốt ở môn Công nghệ (8,5) và Tin học (8,0) – đây là những kỹ năng thực hành tuyệt vời! Dù môn Toán và Tiếng Anh có thể đang là thử thách với em trong kỳ thi vào 10, em hãy nhớ rằng thi THPT không phải là con đường duy nhất. Rất nhiều trường Trung cấp và Cao đẳng nghề đào tạo Công nghệ/Kỹ thuật đang mở rộng cửa đón những học sinh có thế mạnh thực hành như em. Mục tiêu quan trọng nhất của em ở HK II: tiếp tục cố gắng hoàn thành tốt các môn học còn lại để đạt kết quả tốt nghiệp THCS thật đẹp. Tấm bằng THCS chính là tấm vé giúp em vững vàng bước vào trường nghề mơ ước. Thầy cô luôn tin tưởng và đồng hành cùng em!”</w:t>
       </w:r>
     </w:p>
     <w:p>
@@ -6863,7 +6597,7 @@
         <w:pStyle w:val="Heading2"/>
       </w:pPr>
       <w:bookmarkStart w:id="48" w:name="_Toc241525768"/>
-      <w:bookmarkStart w:id="49" w:name="_Toc242916477"/>
+      <w:bookmarkStart w:id="49" w:name="_Toc242976274"/>
       <w:r>
         <w:rPr>
           <w:rFonts w:eastAsia="Times New Roman"/>
@@ -7560,7 +7294,7 @@
         <w:pStyle w:val="Heading2"/>
       </w:pPr>
       <w:bookmarkStart w:id="50" w:name="_Toc241525769"/>
-      <w:bookmarkStart w:id="51" w:name="_Toc242916478"/>
+      <w:bookmarkStart w:id="51" w:name="_Toc242976275"/>
       <w:r>
         <w:rPr>
           <w:rFonts w:eastAsia="Times New Roman"/>
@@ -7588,7 +7322,7 @@
       <w:pPr>
         <w:pStyle w:val="Heading2"/>
       </w:pPr>
-      <w:bookmarkStart w:id="52" w:name="_Toc242916479"/>
+      <w:bookmarkStart w:id="52" w:name="_Toc242976276"/>
       <w:r>
         <w:rPr>
           <w:rFonts w:eastAsia="Times New Roman"/>
@@ -9142,15 +8876,7 @@
           <w:sz w:val="26"/>
           <w:szCs w:val="26"/>
         </w:rPr>
-        <w:t>Kiểm định Friedman trên 120 khối (lần chạy × môn) cho thấy các mô hình khác nhau có ý nghĩa thống kê (χ² = 559,11, p &lt; 0,001; khoảng cách tới hạn Nemenyi 1,24). Mô hình có sai số thấp nhất là TabPFN (RMSE 0,444); khung XEdu-KANFormer đạt RMSE 0,634, MAE 0,480, xếp hạng 6/10. Theo kiểm định Wilcoxon trên sai số từng học sinh, khung đề xuất tốt hơn có ý nghĩa so với FT-Transformer, Hồi quy tuyến tính; chưa khác biệt có ý nghĩa với Bi-LSTM, TabNet; và còn kém Kanformer, MLP, TabKANet, TabPFN, XGBoost. Độ phủ k</w:t>
-      </w:r>
-      <w:r>
-        <w:rPr>
-          <w:rFonts w:eastAsia="Times New Roman"/>
-          <w:sz w:val="26"/>
-          <w:szCs w:val="26"/>
-        </w:rPr>
-        <w:t>hoảng dự đoán của mọi mô hình đạt 0,917–0,927, đáp ứng mục tiêu 90%.</w:t>
+        <w:t>Kiểm định Friedman trên 120 khối (lần chạy × môn) cho thấy các mô hình khác nhau có ý nghĩa thống kê (χ² = 559,11, p &lt; 0,001; khoảng cách tới hạn Nemenyi 1,24). Mô hình có sai số thấp nhất là TabPFN (RMSE 0,444); khung XEdu-KANFormer đạt RMSE 0,634, MAE 0,480, xếp hạng 6/10. Theo kiểm định Wilcoxon trên sai số từng học sinh, khung đề xuất tốt hơn có ý nghĩa so với FT-Transformer, Hồi quy tuyến tính; chưa khác biệt có ý nghĩa với Bi-LSTM, TabNet; và còn kém Kanformer, MLP, TabKANet, TabPFN, XGBoost. Độ phủ khoảng dự đoán của mọi mô hình đạt 0,917–0,927, đáp ứng mục tiêu 90%.</w:t>
       </w:r>
     </w:p>
     <w:p>
@@ -9208,15 +8934,7 @@
           <w:sz w:val="26"/>
           <w:szCs w:val="26"/>
         </w:rPr>
-        <w:t>Khoảng cách giữa khung đề xuất và mô hình nền tảng TabPFN (0,634 so với 0,444) cho thấy khung còn dư địa cải thiện với 1.531 cửa sổ huấn luyện. Trong giai đoạn thực hiện luận văn, đề tài sẽ thực hiện nghiên cứu loại bỏ thành phần đầy đủ, dò tìm siêu tham số (kích thước ẩn, số khối, trọng số đa nhiệm λ) bằng tập kiểm định, bổ sung các phép giải thích SHAP, Integrated Gradients, attention rollout và phản thực theo DiCE, và kiểm chứng trên bộ dữ liệu công khai. Một hệ thống web thử nghiệm (phân tích từng học s</w:t>
-      </w:r>
-      <w:r>
-        <w:rPr>
-          <w:rFonts w:eastAsia="Times New Roman"/>
-          <w:sz w:val="26"/>
-          <w:szCs w:val="26"/>
-        </w:rPr>
-        <w:t>inh, lớp, khối; dự đoán kèm khoảng tin cậy; phản hồi bằng LLM chạy cục bộ có giáo viên duyệt) đã được xây dựng để phục vụ khảo sát ở mục 5.7.</w:t>
+        <w:t>Nghiên cứu loại bỏ thành phần (15 lần chạy cho mỗi biến thể) cho thấy: bỏ chú ý liên môn làm sai số tăng (RMSE 0,646 so với 0,634), xác nhận cấu trúc liên môn có đóng góp; bỏ đầu ra đa nhiệm đưa RMSE xuống 0,570, xếp sau TabPFN và XGBoost và vượt MLP, cho thấy trọng số đa nhiệm λ = 0,3 chọn thủ công đang làm giảm chất lượng hồi quy; thay GR-KAN bằng MLP (0,614) hoặc bỏ token hóa KAN (0,624) cho kết quả tương đương. Trong giai đoạn thực hiện luận văn, đề tài sẽ chọn trọng số đa nhiệm λ và các siêu tham số khác (kích thước ẩn, số khối) bằng tập kiểm định, bổ sung các phép giải thích SHAP, Integrated Gradients, attention rollout và phản thực theo DiCE, và kiểm chứng trên bộ dữ liệu công khai. Một hệ thống web thử nghiệm (phân tích từng học sinh theo từng học kỳ, lớp, khối; dự đoán kèm khoảng tin cậy; phản hồi bằng LLM chạy cục bộ có giáo viên duyệt) đã được xây dựng để phục vụ khảo sát ở mục 5.7.</w:t>
       </w:r>
     </w:p>
     <w:p>
@@ -9224,7 +8942,7 @@
         <w:pStyle w:val="Heading1"/>
       </w:pPr>
       <w:bookmarkStart w:id="53" w:name="_Toc241525770"/>
-      <w:bookmarkStart w:id="54" w:name="_Toc242916480"/>
+      <w:bookmarkStart w:id="54" w:name="_Toc242976277"/>
       <w:r>
         <w:t>6. KẾT QUẢ, SẢN PHẨM VÀ ĐÓNG GÓP DỰ KIẾN</w:t>
       </w:r>
@@ -9236,7 +8954,7 @@
         <w:pStyle w:val="Heading2"/>
       </w:pPr>
       <w:bookmarkStart w:id="55" w:name="_Toc241525771"/>
-      <w:bookmarkStart w:id="56" w:name="_Toc242916481"/>
+      <w:bookmarkStart w:id="56" w:name="_Toc242976278"/>
       <w:r>
         <w:rPr>
           <w:rFonts w:eastAsia="Times New Roman"/>
@@ -9338,7 +9056,7 @@
         <w:pStyle w:val="Heading2"/>
       </w:pPr>
       <w:bookmarkStart w:id="57" w:name="_Toc241525772"/>
-      <w:bookmarkStart w:id="58" w:name="_Toc242916482"/>
+      <w:bookmarkStart w:id="58" w:name="_Toc242976279"/>
       <w:r>
         <w:rPr>
           <w:rFonts w:eastAsia="Times New Roman"/>
@@ -9433,7 +9151,7 @@
         <w:pStyle w:val="Heading2"/>
       </w:pPr>
       <w:bookmarkStart w:id="59" w:name="_Toc241525773"/>
-      <w:bookmarkStart w:id="60" w:name="_Toc242916483"/>
+      <w:bookmarkStart w:id="60" w:name="_Toc242976280"/>
       <w:r>
         <w:rPr>
           <w:rFonts w:eastAsia="Times New Roman"/>
@@ -9516,7 +9234,7 @@
         <w:pStyle w:val="Heading1"/>
       </w:pPr>
       <w:bookmarkStart w:id="61" w:name="_Toc241525774"/>
-      <w:bookmarkStart w:id="62" w:name="_Toc242916484"/>
+      <w:bookmarkStart w:id="62" w:name="_Toc242976281"/>
       <w:r>
         <w:t>7. CẤU TRÚC DỰ KIẾN CỦA LUẬN VĂN</w:t>
       </w:r>
@@ -10102,7 +9820,7 @@
         <w:jc w:val="center"/>
       </w:pPr>
       <w:bookmarkStart w:id="63" w:name="_Toc241525775"/>
-      <w:bookmarkStart w:id="64" w:name="_Toc242916485"/>
+      <w:bookmarkStart w:id="64" w:name="_Toc242976282"/>
       <w:r>
         <w:t>TÀI LIỆU THAM KHẢO</w:t>
       </w:r>
@@ -10131,12 +9849,6 @@
           <w:sz w:val="26"/>
         </w:rPr>
         <w:tab/>
-      </w:r>
-      <w:r>
-        <w:rPr>
-          <w:rFonts w:eastAsia="Times New Roman"/>
-          <w:sz w:val="26"/>
-        </w:rPr>
         <w:t xml:space="preserve">Thủ tướng Chính phủ, </w:t>
       </w:r>
       <w:r>
@@ -10322,12 +10034,6 @@
           <w:sz w:val="26"/>
         </w:rPr>
         <w:tab/>
-      </w:r>
-      <w:r>
-        <w:rPr>
-          <w:rFonts w:eastAsia="Times New Roman"/>
-          <w:sz w:val="26"/>
-        </w:rPr>
         <w:t xml:space="preserve">Y. Gorishniy, I. Rubachev, V. Khrulkov, and A. Babenko, "Revisiting deep learning models for tabular data," in </w:t>
       </w:r>
       <w:r>
@@ -10408,12 +10114,6 @@
           <w:sz w:val="26"/>
         </w:rPr>
         <w:tab/>
-      </w:r>
-      <w:r>
-        <w:rPr>
-          <w:rFonts w:eastAsia="Times New Roman"/>
-          <w:sz w:val="26"/>
-        </w:rPr>
         <w:t xml:space="preserve">Z. Liu, Y. Wang, S. Vaidya, F. Ruehle, J. Halverson, M. Soljačić, T. Y. Hou, and M. Tegmark, "KAN: Kolmogorov–Arnold networks," in </w:t>
       </w:r>
       <w:r>
@@ -10734,12 +10434,6 @@
           <w:sz w:val="26"/>
         </w:rPr>
         <w:tab/>
-      </w:r>
-      <w:r>
-        <w:rPr>
-          <w:rFonts w:eastAsia="Times New Roman"/>
-          <w:sz w:val="26"/>
-        </w:rPr>
         <w:t xml:space="preserve">H.-C. Chen, E. Prasetyo, S.-S. Tseng, K. T. Putra, Prayitno, S. S. Kusumawardani, and C.-E. Weng, "Week-wise student performance early prediction in virtual learning environment using a deep explainable artificial intelligence," </w:t>
       </w:r>
       <w:r>
@@ -10860,12 +10554,6 @@
           <w:sz w:val="26"/>
         </w:rPr>
         <w:tab/>
-      </w:r>
-      <w:r>
-        <w:rPr>
-          <w:rFonts w:eastAsia="Times New Roman"/>
-          <w:sz w:val="26"/>
-        </w:rPr>
         <w:t xml:space="preserve">Y. Liu, Y. Hui, D. Hou, and X. Liu, "A novel student achievement prediction method based on deep learning and attention mechanism," </w:t>
       </w:r>
       <w:r>
@@ -10946,12 +10634,6 @@
           <w:sz w:val="26"/>
         </w:rPr>
         <w:tab/>
-      </w:r>
-      <w:r>
-        <w:rPr>
-          <w:rFonts w:eastAsia="Times New Roman"/>
-          <w:sz w:val="26"/>
-        </w:rPr>
         <w:t xml:space="preserve">B. Alnasyan, M. Basheri, M. Alassafi, and K. Alnasyan, "Kanformer: An attention-enhanced deep learning model for predicting student performance in virtual learning environments," </w:t>
       </w:r>
       <w:r>
@@ -11072,12 +10754,6 @@
           <w:sz w:val="26"/>
         </w:rPr>
         <w:tab/>
-      </w:r>
-      <w:r>
-        <w:rPr>
-          <w:rFonts w:eastAsia="Times New Roman"/>
-          <w:sz w:val="26"/>
-        </w:rPr>
         <w:t xml:space="preserve">P. Buñay-Guisñan, A. Cano, A. Anguera, J. A. Lara, and C. Romero, "Group counterfactual explanations: A use case to support students at risk of dropping out in online education," </w:t>
       </w:r>
       <w:r>
@@ -11198,12 +10874,6 @@
           <w:sz w:val="26"/>
         </w:rPr>
         <w:tab/>
-      </w:r>
-      <w:r>
-        <w:rPr>
-          <w:rFonts w:eastAsia="Times New Roman"/>
-          <w:sz w:val="26"/>
-        </w:rPr>
         <w:t xml:space="preserve">H.-D. Le, T.-T. Huynh-Cam, L.-S. Chen, V. P. T. Ngan, and T.-C. Lu, "Predicting the learning performance of minority students in a Vietnamese high school using artificial intelligence algorithms," </w:t>
       </w:r>
       <w:r>
@@ -11284,12 +10954,6 @@
           <w:sz w:val="26"/>
         </w:rPr>
         <w:tab/>
-      </w:r>
-      <w:r>
-        <w:rPr>
-          <w:rFonts w:eastAsia="Times New Roman"/>
-          <w:sz w:val="26"/>
-        </w:rPr>
         <w:t xml:space="preserve">S. Ghimire, S. Abdulla, L. P. Joseph, S. Prasad, A. Murphy, A. Devi, P. D. Barua, R. C. Deo, R. Acharya, and Z. M. Yaseen, "Explainable artificial intelligence-machine learning models to estimate overall scores in tertiary preparatory general science course," </w:t>
       </w:r>
       <w:r>
@@ -11595,12 +11259,6 @@
           <w:sz w:val="26"/>
         </w:rPr>
         <w:tab/>
-      </w:r>
-      <w:r>
-        <w:rPr>
-          <w:rFonts w:eastAsia="Times New Roman"/>
-          <w:sz w:val="26"/>
-        </w:rPr>
         <w:t>J. Ho, N. Kalchbrenner, D. Weissenborn, and T. Salimans, "Axial attention in multidimensional transformers," arXiv:1912.12180, 2019.</w:t>
       </w:r>
     </w:p>
@@ -11786,12 +11444,6 @@
           <w:sz w:val="26"/>
         </w:rPr>
         <w:tab/>
-      </w:r>
-      <w:r>
-        <w:rPr>
-          <w:rFonts w:eastAsia="Times New Roman"/>
-          <w:sz w:val="26"/>
-        </w:rPr>
         <w:t xml:space="preserve">C. Rudin, "Stop explaining black box machine learning models for high stakes decisions and use interpretable models instead," </w:t>
       </w:r>
       <w:r>
@@ -11872,12 +11524,6 @@
           <w:sz w:val="26"/>
         </w:rPr>
         <w:tab/>
-      </w:r>
-      <w:r>
-        <w:rPr>
-          <w:rFonts w:eastAsia="Times New Roman"/>
-          <w:sz w:val="26"/>
-        </w:rPr>
         <w:t xml:space="preserve">A. N. Angelopoulos and S. Bates, "Conformal prediction: A gentle introduction," </w:t>
       </w:r>
       <w:r>
@@ -11958,12 +11604,6 @@
           <w:sz w:val="26"/>
         </w:rPr>
         <w:tab/>
-      </w:r>
-      <w:r>
-        <w:rPr>
-          <w:rFonts w:eastAsia="Times New Roman"/>
-          <w:sz w:val="26"/>
-        </w:rPr>
         <w:t xml:space="preserve">K. Peffers, T. Tuunanen, M. A. Rothenberger, and S. Chatterjee, "A design science research methodology for information systems research," </w:t>
       </w:r>
       <w:r>

</xml_diff>